<commit_message>
Align Figure 5 legend with supplementary state analysis
</commit_message>
<xml_diff>
--- a/outputs/manuscript/final_submission/MCOP_CRC_manuscript_final.docx
+++ b/outputs/manuscript/final_submission/MCOP_CRC_manuscript_final.docx
@@ -437,7 +437,7 @@
         <w:spacing w:after="120"/>
       </w:pPr>
       <w:r>
-        <w:t xml:space="preserve">The effect was not adequately described as global PPAR suppression. Within enterocyte-like epithelium, the PPAR/nuclear-receptor score was lower in tumor samples (n=24 paired donors; median delta −0.191; FDR 5.3 × 10⁻⁴), whereas secretory-like epithelium showed a modest increase (n=27; median delta +0.068; FDR=0.018). Together with epithelial compositional redistribution, these findings support state-specific regulatory remodeling rather than a uniform pan-epithelial effect [27,28,36-38].</w:t>
+        <w:t xml:space="preserve">The effect was not adequately described as global PPAR suppression (Supplementary Fig. S4). Within enterocyte-like epithelium, the PPAR/nuclear-receptor score was lower in tumor samples (n=24 paired donors; median delta −0.191; FDR 5.3 × 10⁻⁴), whereas secretory-like epithelium showed a modest increase (n=27; median delta +0.068; FDR=0.018). Together with epithelial compositional redistribution, these findings support state-specific regulatory remodeling rather than a uniform pan-epithelial effect [27,28,36-38].</w:t>
       </w:r>
     </w:p>
     <w:p>
@@ -485,7 +485,7 @@
         <w:spacing w:after="120"/>
       </w:pPr>
       <w:r>
-        <w:t xml:space="preserve">The transcriptomic analyses add an independent disease-state layer. PPAR/nuclear-receptor remodeling was reproducible across multiple pathway and regulon definitions, but the within-state audit changed the biological interpretation: enterocyte-like epithelium showed suppression, whereas secretory-like epithelium showed modest elevation. Thus, the CRC phenotype is more accurately described as state-specific PPAR/nuclear-receptor remodeling than as global pathway suppression. This distinction is important because it prevents a complex epithelial state transition from being reduced to a single pathway-direction claim.</w:t>
+        <w:t xml:space="preserve">The transcriptomic analyses add an independent disease-state layer. PPAR/nuclear-receptor remodeling was reproducible across multiple pathway and regulon definitions, but the within-state audit changed the biological interpretation (Supplementary Fig. S4): enterocyte-like epithelium showed suppression, whereas secretory-like epithelium showed modest elevation. Thus, the CRC phenotype is more accurately described as state-specific PPAR/nuclear-receptor remodeling than as global pathway suppression. This distinction is important because it prevents a complex epithelial state transition from being reduced to a single pathway-direction claim.</w:t>
       </w:r>
     </w:p>
     <w:p>
@@ -608,7 +608,7 @@
         <w:t xml:space="preserve">Figure 5. </w:t>
       </w:r>
       <w:r>
-        <w:t xml:space="preserve">CRC disease-state biology: state-specific PPAR/nuclear-receptor remodeling, highlighting opposing epithelial-state patterns that may help explain prior inconsistent PPAR findings. The environmental bridge is dashed and explicitly untested.</w:t>
+        <w:t xml:space="preserve">CRC disease-state convergence across platforms and cell compartments. (A) Paired tumor–normal analyses show lower PPAR/nuclear-receptor scores in TCGA bulk and two epithelial datasets. (B) Donor-level epithelial changes show concurrent PPAR/NR decrease and RELA/STAT3 increase without implying mediation. (C) Compartment analysis shows an epithelial decrease, no material endothelial change and an opposite myeloid increase. Within-epithelial state-specific analyses are reported in Supplementary Fig. S4. These disease-state data do not establish an environmental causal bridge.</w:t>
       </w:r>
     </w:p>
     <w:p>

</xml_diff>